<commit_message>
Revise testimony sentence in Exodus 3:11-15 revision 40
Co-Authored-By: Claude Opus 5.5 <noreply@anthropic.com>
Claude-Session: https://claude.ai/code/session_01TwP3cK2cXFuBu3G42S6cAu
</commit_message>
<xml_diff>
--- a/output/exodus3/출애굽기 3장 11-15절 주해보고서 수정안40_261002.docx
+++ b/output/exodus3/출애굽기 3장 11-15절 주해보고서 수정안40_261002.docx
@@ -898,7 +898,10 @@
         <w:jc w:val="both"/>
       </w:pPr>
       <w:r>
-        <w:t xml:space="preserve">본인은 기도하다가 히브리어로 외워 둔 두 구절, 「</w:t>
+        <w:t xml:space="preserve">본인은 히브리어를 공부하며 외워 둔 </w:t>
+      </w:r>
+      <w:r>
+        <w:t xml:space="preserve">「</w:t>
       </w:r>
       <w:r>
         <w:rPr>
@@ -907,7 +910,13 @@
         <w:t xml:space="preserve">הוּא צוּרִי וִישׁוּעָתִי‎</w:t>
       </w:r>
       <w:r>
-        <w:t xml:space="preserve">」(그는 나의 반석이요 나의 구원이시다, 시 62:2[마소라 본문 62:3])와 「</w:t>
+        <w:t xml:space="preserve">」(그는 나의 반석이요 나의 구원이시다, 시 62:2[마소라 본문 </w:t>
+      </w:r>
+      <w:r>
+        <w:t xml:space="preserve">62:3])가 기도 중에 강하게 떠오르고, 이어서 </w:t>
+      </w:r>
+      <w:r>
+        <w:t xml:space="preserve">「</w:t>
       </w:r>
       <w:r>
         <w:rPr>
@@ -916,7 +925,13 @@
         <w:t xml:space="preserve">זֶה־שְּׁמִי לְעֹלָם‎</w:t>
       </w:r>
       <w:r>
-        <w:t xml:space="preserve">」이 한꺼번에 떠오른 일이 있다. 성령께서 생각나게 하신 것인가 하여 사나흘을 끙끙거리다 성경을 펴 보고서야 알았다. 나의 반석이요 구원이신 그분이 누구시냐는 물음의 답이 바로 영원토록 기억될 그 이름이었다. 모세에게 이 이름이 무엇이었을지, 그것이 지금 본인과 무슨 상관이 있는지는 그다음 물음이었다.</w:t>
+        <w:t xml:space="preserve">」</w:t>
+      </w:r>
+      <w:r>
+        <w:t xml:space="preserve">이 가슴에 사무치게 떠오른 일이 있다.</w:t>
+      </w:r>
+      <w:r>
+        <w:t xml:space="preserve"> 성령께서 생각나게 하신 것인가 하여 사나흘을 끙끙거리다 성경을 펴 보고서야 알았다. 나의 반석이요 구원이신 그분이 누구시냐는 물음의 답이 바로 영원토록 기억될 그 이름이었다. 모세에게 이 이름이 무엇이었을지, 그것이 지금 본인과 무슨 상관이 있는지는 그다음 물음이었다.</w:t>
       </w:r>
     </w:p>
     <w:p>

</xml_diff>

<commit_message>
Add personal calling sentences to Exodus 3:11-15 revision 40
Co-Authored-By: Claude Fable 5.1 <noreply@anthropic.com>
Claude-Session: https://claude.ai/code/session_01TwP3cK2cXFuBu3G42S6cAu
</commit_message>
<xml_diff>
--- a/output/exodus3/출애굽기 3장 11-15절 주해보고서 수정안40_261002.docx
+++ b/output/exodus3/출애굽기 3장 11-15절 주해보고서 수정안40_261002.docx
@@ -931,7 +931,10 @@
         <w:t xml:space="preserve">이 가슴에 사무치게 떠오른 일이 있다.</w:t>
       </w:r>
       <w:r>
-        <w:t xml:space="preserve"> 성령께서 생각나게 하신 것인가 하여 사나흘을 끙끙거리다 성경을 펴 보고서야 알았다. 나의 반석이요 구원이신 그분이 누구시냐는 물음의 답이 바로 영원토록 기억될 그 이름이었다. 모세에게 이 이름이 무엇이었을지, 그것이 지금 본인과 무슨 상관이 있는지는 그다음 물음이었다.</w:t>
+        <w:t xml:space="preserve"> 성령께서 생각나게 하신 것인가 하여 사나흘을 끙끙거리다 성경을 펴 보고서야 알았다. 나의 반석이요 구원이신 그분이 누구시냐는 물음의 답이 바로 영원토록 기억될 그 이름이었다. 모세에게 이 이름이 무엇이었을지, 그것이 지금 본인과 </w:t>
+      </w:r>
+      <w:r>
+        <w:t xml:space="preserve">무슨 상관이 있는지는 그다음 물음이었다. 쉰하나에 사업이 아니라 신학을 붙든 본인의 물음도 처음에는 "내가 누구이기에"였다. 이 본문이 본인에게 돌려준 것은 본인이 누구인가에 대한 답이 아니라, 누가 함께 가시는가에 대한 답이었다.</w:t>
       </w:r>
     </w:p>
     <w:p>

</xml_diff>